<commit_message>
TG-126: Add full PDF and DOCX generation for all documents and submission requirements update
</commit_message>
<xml_diff>
--- a/docs/Submission_Requirements.docx
+++ b/docs/Submission_Requirements.docx
@@ -1,1865 +1,3 @@
-
-<file path=word/document.xml><?xml version="1.0" encoding="utf-8"?>
-<w:document xmlns:wpc="http://schemas.microsoft.com/office/word/2010/wordprocessingCanvas" xmlns:mo="http://schemas.microsoft.com/office/mac/office/2008/main" xmlns:mc="http://schemas.openxmlformats.org/markup-compatibility/2006" xmlns:mv="urn:schemas-microsoft-com:mac:vml" xmlns:o="urn:schemas-microsoft-com:office:office" xmlns:r="http://schemas.openxmlformats.org/officeDocument/2006/relationships" xmlns:m="http://schemas.openxmlformats.org/officeDocument/2006/math" xmlns:v="urn:schemas-microsoft-com:vml" xmlns:wp14="http://schemas.microsoft.com/office/word/2010/wordprocessingDrawing" xmlns:wp="http://schemas.openxmlformats.org/drawingml/2006/wordprocessingDrawing" xmlns:w10="urn:schemas-microsoft-com:office:word" xmlns:w="http://schemas.openxmlformats.org/wordprocessingml/2006/main" xmlns:w14="http://schemas.microsoft.com/office/word/2010/wordml" xmlns:wpg="http://schemas.microsoft.com/office/word/2010/wordprocessingGroup" xmlns:wpi="http://schemas.microsoft.com/office/word/2010/wordprocessingInk" xmlns:wne="http://schemas.microsoft.com/office/word/2006/wordml" xmlns:wps="http://schemas.microsoft.com/office/word/2010/wordprocessingShape" mc:Ignorable="w14 wp14">
-  <w:body>
-    <w:p>
-      <w:pPr>
-        <w:spacing w:after="480"/>
-        <w:jc w:val="center"/>
-      </w:pPr>
-      <w:r>
-        <w:rPr>
-          <w:rFonts w:ascii="Arial" w:hAnsi="Arial"/>
-          <w:b/>
-          <w:color w:val="1A365D"/>
-          <w:sz w:val="48"/>
-        </w:rPr>
-        <w:t>Submission Requirements</w:t>
-      </w:r>
-    </w:p>
-    <w:p>
-      <w:pPr>
-        <w:spacing w:before="360" w:after="160"/>
-      </w:pPr>
-      <w:r>
-        <w:rPr>
-          <w:rFonts w:ascii="Arial" w:hAnsi="Arial"/>
-          <w:b/>
-          <w:color w:val="1A365D"/>
-          <w:sz w:val="36"/>
-        </w:rPr>
-        <w:t>Project Submission Requirements</w:t>
-      </w:r>
-    </w:p>
-    <w:p>
-      <w:pPr>
-        <w:spacing w:after="120"/>
-      </w:pPr>
-    </w:p>
-    <w:tbl>
-      <w:tblPr>
-        <w:tblStyle w:val="LightShading-Accent1"/>
-        <w:tblW w:type="auto" w:w="0"/>
-        <w:tblLook w:firstColumn="1" w:firstRow="1" w:lastColumn="0" w:lastRow="0" w:noHBand="0" w:noVBand="1" w:val="04A0"/>
-      </w:tblPr>
-      <w:tblGrid>
-        <w:gridCol w:w="4680"/>
-        <w:gridCol w:w="4680"/>
-      </w:tblGrid>
-      <w:tr>
-        <w:tc>
-          <w:tcPr>
-            <w:tcW w:type="dxa" w:w="4680"/>
-          </w:tcPr>
-          <w:p>
-            <w:pPr>
-              <w:spacing w:after="40" w:before="40"/>
-            </w:pPr>
-            <w:r>
-              <w:rPr>
-                <w:rFonts w:ascii="Arial" w:hAnsi="Arial"/>
-                <w:sz w:val="19"/>
-              </w:rPr>
-              <w:t>Parameter</w:t>
-            </w:r>
-          </w:p>
-        </w:tc>
-        <w:tc>
-          <w:tcPr>
-            <w:tcW w:type="dxa" w:w="4680"/>
-          </w:tcPr>
-          <w:p>
-            <w:pPr>
-              <w:spacing w:after="40" w:before="40"/>
-            </w:pPr>
-            <w:r>
-              <w:rPr>
-                <w:rFonts w:ascii="Arial" w:hAnsi="Arial"/>
-                <w:sz w:val="19"/>
-              </w:rPr>
-              <w:t>Details</w:t>
-            </w:r>
-          </w:p>
-        </w:tc>
-      </w:tr>
-    </w:tbl>
-    <w:tbl>
-      <w:tblPr>
-        <w:tblStyle w:val="LightShading-Accent1"/>
-        <w:tblW w:type="auto" w:w="0"/>
-        <w:tblLook w:firstColumn="1" w:firstRow="1" w:lastColumn="0" w:lastRow="0" w:noHBand="0" w:noVBand="1" w:val="04A0"/>
-      </w:tblPr>
-      <w:tblGrid>
-        <w:gridCol w:w="4680"/>
-        <w:gridCol w:w="4680"/>
-      </w:tblGrid>
-      <w:tr>
-        <w:tc>
-          <w:tcPr>
-            <w:tcW w:type="dxa" w:w="4680"/>
-          </w:tcPr>
-          <w:p>
-            <w:pPr>
-              <w:spacing w:after="40" w:before="40"/>
-            </w:pPr>
-            <w:r>
-              <w:rPr>
-                <w:rFonts w:ascii="Arial" w:hAnsi="Arial"/>
-                <w:sz w:val="19"/>
-              </w:rPr>
-              <w:t>**Institution**</w:t>
-            </w:r>
-          </w:p>
-        </w:tc>
-        <w:tc>
-          <w:tcPr>
-            <w:tcW w:type="dxa" w:w="4680"/>
-          </w:tcPr>
-          <w:p>
-            <w:pPr>
-              <w:spacing w:after="40" w:before="40"/>
-            </w:pPr>
-            <w:r>
-              <w:rPr>
-                <w:rFonts w:ascii="Arial" w:hAnsi="Arial"/>
-                <w:sz w:val="19"/>
-              </w:rPr>
-              <w:t>Brevet de Technicien Supérieur</w:t>
-            </w:r>
-          </w:p>
-        </w:tc>
-      </w:tr>
-    </w:tbl>
-    <w:tbl>
-      <w:tblPr>
-        <w:tblStyle w:val="LightShading-Accent1"/>
-        <w:tblW w:type="auto" w:w="0"/>
-        <w:tblLook w:firstColumn="1" w:firstRow="1" w:lastColumn="0" w:lastRow="0" w:noHBand="0" w:noVBand="1" w:val="04A0"/>
-      </w:tblPr>
-      <w:tblGrid>
-        <w:gridCol w:w="4680"/>
-        <w:gridCol w:w="4680"/>
-      </w:tblGrid>
-      <w:tr>
-        <w:tc>
-          <w:tcPr>
-            <w:tcW w:type="dxa" w:w="4680"/>
-          </w:tcPr>
-          <w:p>
-            <w:pPr>
-              <w:spacing w:after="40" w:before="40"/>
-            </w:pPr>
-            <w:r>
-              <w:rPr>
-                <w:rFonts w:ascii="Arial" w:hAnsi="Arial"/>
-                <w:sz w:val="19"/>
-              </w:rPr>
-              <w:t>**Module**</w:t>
-            </w:r>
-          </w:p>
-        </w:tc>
-        <w:tc>
-          <w:tcPr>
-            <w:tcW w:type="dxa" w:w="4680"/>
-          </w:tcPr>
-          <w:p>
-            <w:pPr>
-              <w:spacing w:after="40" w:before="40"/>
-            </w:pPr>
-            <w:r>
-              <w:rPr>
-                <w:rFonts w:ascii="Arial" w:hAnsi="Arial"/>
-                <w:sz w:val="19"/>
-              </w:rPr>
-              <w:t>DEVOP1 - Project Submission Requirements</w:t>
-            </w:r>
-          </w:p>
-        </w:tc>
-      </w:tr>
-    </w:tbl>
-    <w:tbl>
-      <w:tblPr>
-        <w:tblStyle w:val="LightShading-Accent1"/>
-        <w:tblW w:type="auto" w:w="0"/>
-        <w:tblLook w:firstColumn="1" w:firstRow="1" w:lastColumn="0" w:lastRow="0" w:noHBand="0" w:noVBand="1" w:val="04A0"/>
-      </w:tblPr>
-      <w:tblGrid>
-        <w:gridCol w:w="4680"/>
-        <w:gridCol w:w="4680"/>
-      </w:tblGrid>
-      <w:tr>
-        <w:tc>
-          <w:tcPr>
-            <w:tcW w:type="dxa" w:w="4680"/>
-          </w:tcPr>
-          <w:p>
-            <w:pPr>
-              <w:spacing w:after="40" w:before="40"/>
-            </w:pPr>
-            <w:r>
-              <w:rPr>
-                <w:rFonts w:ascii="Arial" w:hAnsi="Arial"/>
-                <w:sz w:val="19"/>
-              </w:rPr>
-              <w:t>**Date**</w:t>
-            </w:r>
-          </w:p>
-        </w:tc>
-        <w:tc>
-          <w:tcPr>
-            <w:tcW w:type="dxa" w:w="4680"/>
-          </w:tcPr>
-          <w:p>
-            <w:pPr>
-              <w:spacing w:after="40" w:before="40"/>
-            </w:pPr>
-            <w:r>
-              <w:rPr>
-                <w:rFonts w:ascii="Arial" w:hAnsi="Arial"/>
-                <w:sz w:val="19"/>
-              </w:rPr>
-              <w:t>24.06.2026</w:t>
-            </w:r>
-          </w:p>
-        </w:tc>
-      </w:tr>
-    </w:tbl>
-    <w:tbl>
-      <w:tblPr>
-        <w:tblStyle w:val="LightShading-Accent1"/>
-        <w:tblW w:type="auto" w:w="0"/>
-        <w:tblLook w:firstColumn="1" w:firstRow="1" w:lastColumn="0" w:lastRow="0" w:noHBand="0" w:noVBand="1" w:val="04A0"/>
-      </w:tblPr>
-      <w:tblGrid>
-        <w:gridCol w:w="4680"/>
-        <w:gridCol w:w="4680"/>
-      </w:tblGrid>
-      <w:tr>
-        <w:tc>
-          <w:tcPr>
-            <w:tcW w:type="dxa" w:w="4680"/>
-          </w:tcPr>
-          <w:p>
-            <w:pPr>
-              <w:spacing w:after="40" w:before="40"/>
-            </w:pPr>
-            <w:r>
-              <w:rPr>
-                <w:rFonts w:ascii="Arial" w:hAnsi="Arial"/>
-                <w:sz w:val="19"/>
-              </w:rPr>
-              <w:t>**Delivery**</w:t>
-            </w:r>
-          </w:p>
-        </w:tc>
-        <w:tc>
-          <w:tcPr>
-            <w:tcW w:type="dxa" w:w="4680"/>
-          </w:tcPr>
-          <w:p>
-            <w:pPr>
-              <w:spacing w:after="40" w:before="40"/>
-            </w:pPr>
-            <w:r>
-              <w:rPr>
-                <w:rFonts w:ascii="Arial" w:hAnsi="Arial"/>
-                <w:sz w:val="19"/>
-              </w:rPr>
-              <w:t>24.06.2026</w:t>
-            </w:r>
-          </w:p>
-        </w:tc>
-      </w:tr>
-    </w:tbl>
-    <w:tbl>
-      <w:tblPr>
-        <w:tblStyle w:val="LightShading-Accent1"/>
-        <w:tblW w:type="auto" w:w="0"/>
-        <w:tblLook w:firstColumn="1" w:firstRow="1" w:lastColumn="0" w:lastRow="0" w:noHBand="0" w:noVBand="1" w:val="04A0"/>
-      </w:tblPr>
-      <w:tblGrid>
-        <w:gridCol w:w="4680"/>
-        <w:gridCol w:w="4680"/>
-      </w:tblGrid>
-      <w:tr>
-        <w:tc>
-          <w:tcPr>
-            <w:tcW w:type="dxa" w:w="4680"/>
-          </w:tcPr>
-          <w:p>
-            <w:pPr>
-              <w:spacing w:after="40" w:before="40"/>
-            </w:pPr>
-            <w:r>
-              <w:rPr>
-                <w:rFonts w:ascii="Arial" w:hAnsi="Arial"/>
-                <w:sz w:val="19"/>
-              </w:rPr>
-              <w:t>**Presentation**</w:t>
-            </w:r>
-          </w:p>
-        </w:tc>
-        <w:tc>
-          <w:tcPr>
-            <w:tcW w:type="dxa" w:w="4680"/>
-          </w:tcPr>
-          <w:p>
-            <w:pPr>
-              <w:spacing w:after="40" w:before="40"/>
-            </w:pPr>
-            <w:r>
-              <w:rPr>
-                <w:rFonts w:ascii="Arial" w:hAnsi="Arial"/>
-                <w:sz w:val="19"/>
-              </w:rPr>
-              <w:t>01.07.2026</w:t>
-            </w:r>
-          </w:p>
-        </w:tc>
-      </w:tr>
-    </w:tbl>
-    <w:tbl>
-      <w:tblPr>
-        <w:tblStyle w:val="LightShading-Accent1"/>
-        <w:tblW w:type="auto" w:w="0"/>
-        <w:tblLook w:firstColumn="1" w:firstRow="1" w:lastColumn="0" w:lastRow="0" w:noHBand="0" w:noVBand="1" w:val="04A0"/>
-      </w:tblPr>
-      <w:tblGrid>
-        <w:gridCol w:w="4680"/>
-        <w:gridCol w:w="4680"/>
-      </w:tblGrid>
-      <w:tr>
-        <w:tc>
-          <w:tcPr>
-            <w:tcW w:type="dxa" w:w="4680"/>
-          </w:tcPr>
-          <w:p>
-            <w:pPr>
-              <w:spacing w:after="40" w:before="40"/>
-            </w:pPr>
-            <w:r>
-              <w:rPr>
-                <w:rFonts w:ascii="Arial" w:hAnsi="Arial"/>
-                <w:sz w:val="19"/>
-              </w:rPr>
-              <w:t>**Room**</w:t>
-            </w:r>
-          </w:p>
-        </w:tc>
-        <w:tc>
-          <w:tcPr>
-            <w:tcW w:type="dxa" w:w="4680"/>
-          </w:tcPr>
-          <w:p>
-            <w:pPr>
-              <w:spacing w:after="40" w:before="40"/>
-            </w:pPr>
-            <w:r>
-              <w:rPr>
-                <w:rFonts w:ascii="Arial" w:hAnsi="Arial"/>
-                <w:sz w:val="19"/>
-              </w:rPr>
-              <w:t>SC-27</w:t>
-            </w:r>
-          </w:p>
-        </w:tc>
-      </w:tr>
-    </w:tbl>
-    <w:tbl>
-      <w:tblPr>
-        <w:tblStyle w:val="LightShading-Accent1"/>
-        <w:tblW w:type="auto" w:w="0"/>
-        <w:tblLook w:firstColumn="1" w:firstRow="1" w:lastColumn="0" w:lastRow="0" w:noHBand="0" w:noVBand="1" w:val="04A0"/>
-      </w:tblPr>
-      <w:tblGrid>
-        <w:gridCol w:w="4680"/>
-        <w:gridCol w:w="4680"/>
-      </w:tblGrid>
-      <w:tr>
-        <w:tc>
-          <w:tcPr>
-            <w:tcW w:type="dxa" w:w="4680"/>
-          </w:tcPr>
-          <w:p>
-            <w:pPr>
-              <w:spacing w:after="40" w:before="40"/>
-            </w:pPr>
-            <w:r>
-              <w:rPr>
-                <w:rFonts w:ascii="Arial" w:hAnsi="Arial"/>
-                <w:sz w:val="19"/>
-              </w:rPr>
-              <w:t>**Candidates**</w:t>
-            </w:r>
-          </w:p>
-        </w:tc>
-        <w:tc>
-          <w:tcPr>
-            <w:tcW w:type="dxa" w:w="4680"/>
-          </w:tcPr>
-          <w:p>
-            <w:pPr>
-              <w:spacing w:after="40" w:before="40"/>
-            </w:pPr>
-            <w:r>
-              <w:rPr>
-                <w:rFonts w:ascii="Arial" w:hAnsi="Arial"/>
-                <w:sz w:val="19"/>
-              </w:rPr>
-              <w:t>Roni Fernandes Dias / François LANGE</w:t>
-            </w:r>
-          </w:p>
-        </w:tc>
-      </w:tr>
-    </w:tbl>
-    <w:p>
-      <w:pPr>
-        <w:spacing w:after="120"/>
-      </w:pPr>
-    </w:p>
-    <w:p>
-      <w:pPr>
-        <w:spacing w:after="120"/>
-      </w:pPr>
-      <w:r>
-        <w:rPr>
-          <w:rFonts w:ascii="Arial" w:hAnsi="Arial"/>
-          <w:sz w:val="20"/>
-        </w:rPr>
-        <w:t>---</w:t>
-      </w:r>
-    </w:p>
-    <w:p>
-      <w:pPr>
-        <w:spacing w:after="120"/>
-      </w:pPr>
-    </w:p>
-    <w:p>
-      <w:pPr>
-        <w:spacing w:before="280" w:after="120"/>
-      </w:pPr>
-      <w:r>
-        <w:rPr>
-          <w:rFonts w:ascii="Arial" w:hAnsi="Arial"/>
-          <w:b/>
-          <w:color w:val="2B6CB0"/>
-          <w:sz w:val="28"/>
-        </w:rPr>
-        <w:t>Part 1 – Quality Standards &amp; Functional Completion</w:t>
-      </w:r>
-    </w:p>
-    <w:p>
-      <w:pPr>
-        <w:spacing w:after="120"/>
-      </w:pPr>
-    </w:p>
-    <w:p>
-      <w:pPr>
-        <w:spacing w:before="240" w:after="80"/>
-      </w:pPr>
-      <w:r>
-        <w:rPr>
-          <w:rFonts w:ascii="Arial" w:hAnsi="Arial"/>
-          <w:b/>
-          <w:color w:val="2B6CB0"/>
-          <w:sz w:val="24"/>
-        </w:rPr>
-        <w:t>Task 1: Systems Functional Validation</w:t>
-      </w:r>
-    </w:p>
-    <w:p>
-      <w:pPr>
-        <w:spacing w:after="120"/>
-      </w:pPr>
-      <w:r>
-        <w:rPr>
-          <w:rFonts w:ascii="Arial" w:hAnsi="Arial"/>
-          <w:sz w:val="20"/>
-        </w:rPr>
-        <w:t>Ensure that all project tasks and activities outlined in the project plan are fully completed and meet the expected quality standards and functional requirements.</w:t>
-      </w:r>
-    </w:p>
-    <w:p>
-      <w:pPr>
-        <w:spacing w:after="120"/>
-      </w:pPr>
-    </w:p>
-    <w:p>
-      <w:pPr>
-        <w:spacing w:before="240" w:after="80"/>
-      </w:pPr>
-      <w:r>
-        <w:rPr>
-          <w:rFonts w:ascii="Arial" w:hAnsi="Arial"/>
-          <w:b/>
-          <w:color w:val="2B6CB0"/>
-          <w:sz w:val="24"/>
-        </w:rPr>
-        <w:t>Expected Deliverables:</w:t>
-      </w:r>
-    </w:p>
-    <w:p>
-      <w:pPr>
-        <w:pStyle w:val="ListBullet"/>
-        <w:spacing w:after="80"/>
-      </w:pPr>
-      <w:r>
-        <w:rPr>
-          <w:rFonts w:ascii="Arial" w:hAnsi="Arial"/>
-          <w:sz w:val="20"/>
-        </w:rPr>
-        <w:t>A fully functional multi-service containerized stack (MySQL database, Flask API backend, Zabbix Server monitoring, and Apache Airflow scheduler).</w:t>
-      </w:r>
-    </w:p>
-    <w:p>
-      <w:pPr>
-        <w:pStyle w:val="ListBullet"/>
-        <w:spacing w:after="80"/>
-      </w:pPr>
-      <w:r>
-        <w:rPr>
-          <w:rFonts w:ascii="Arial" w:hAnsi="Arial"/>
-          <w:sz w:val="20"/>
-        </w:rPr>
-        <w:t>Functional verification logs proving successful data flows.</w:t>
-      </w:r>
-    </w:p>
-    <w:p>
-      <w:pPr>
-        <w:spacing w:after="120"/>
-      </w:pPr>
-    </w:p>
-    <w:p>
-      <w:pPr>
-        <w:spacing w:after="120"/>
-      </w:pPr>
-      <w:r>
-        <w:rPr>
-          <w:rFonts w:ascii="Arial" w:hAnsi="Arial"/>
-          <w:sz w:val="20"/>
-        </w:rPr>
-        <w:t>---</w:t>
-      </w:r>
-    </w:p>
-    <w:p>
-      <w:pPr>
-        <w:spacing w:after="120"/>
-      </w:pPr>
-    </w:p>
-    <w:p>
-      <w:pPr>
-        <w:spacing w:before="280" w:after="120"/>
-      </w:pPr>
-      <w:r>
-        <w:rPr>
-          <w:rFonts w:ascii="Arial" w:hAnsi="Arial"/>
-          <w:b/>
-          <w:color w:val="2B6CB0"/>
-          <w:sz w:val="28"/>
-        </w:rPr>
-        <w:t>Part 2 – Communication &amp; Alignment</w:t>
-      </w:r>
-    </w:p>
-    <w:p>
-      <w:pPr>
-        <w:spacing w:after="120"/>
-      </w:pPr>
-    </w:p>
-    <w:p>
-      <w:pPr>
-        <w:spacing w:before="240" w:after="80"/>
-      </w:pPr>
-      <w:r>
-        <w:rPr>
-          <w:rFonts w:ascii="Arial" w:hAnsi="Arial"/>
-          <w:b/>
-          <w:color w:val="2B6CB0"/>
-          <w:sz w:val="24"/>
-        </w:rPr>
-        <w:t>Task 1: Supervisor Checkpoints</w:t>
-      </w:r>
-    </w:p>
-    <w:p>
-      <w:pPr>
-        <w:spacing w:after="120"/>
-      </w:pPr>
-      <w:r>
-        <w:rPr>
-          <w:rFonts w:ascii="Arial" w:hAnsi="Arial"/>
-          <w:sz w:val="20"/>
-        </w:rPr>
-        <w:t>Maintain regular communication with your supervisor throughout all phases of the project to ensure alignment and effective implementation of each component.</w:t>
-      </w:r>
-    </w:p>
-    <w:p>
-      <w:pPr>
-        <w:spacing w:after="120"/>
-      </w:pPr>
-    </w:p>
-    <w:p>
-      <w:pPr>
-        <w:spacing w:before="240" w:after="80"/>
-      </w:pPr>
-      <w:r>
-        <w:rPr>
-          <w:rFonts w:ascii="Arial" w:hAnsi="Arial"/>
-          <w:b/>
-          <w:color w:val="2B6CB0"/>
-          <w:sz w:val="24"/>
-        </w:rPr>
-        <w:t>Expected Deliverables:</w:t>
-      </w:r>
-    </w:p>
-    <w:p>
-      <w:pPr>
-        <w:pStyle w:val="ListBullet"/>
-        <w:spacing w:after="80"/>
-      </w:pPr>
-      <w:r>
-        <w:rPr>
-          <w:rFonts w:ascii="Arial" w:hAnsi="Arial"/>
-          <w:sz w:val="20"/>
-        </w:rPr>
-        <w:t>Detailed sprint backlogs, wireframes, and architecture specs reviewed and aligned.</w:t>
-      </w:r>
-    </w:p>
-    <w:p>
-      <w:pPr>
-        <w:pStyle w:val="ListBullet"/>
-        <w:spacing w:after="80"/>
-      </w:pPr>
-      <w:r>
-        <w:rPr>
-          <w:rFonts w:ascii="Arial" w:hAnsi="Arial"/>
-          <w:sz w:val="20"/>
-        </w:rPr>
-        <w:t>Completely sanitized git histories with all sensitive credentials and keys removed.</w:t>
-      </w:r>
-    </w:p>
-    <w:p>
-      <w:pPr>
-        <w:spacing w:after="120"/>
-      </w:pPr>
-    </w:p>
-    <w:p>
-      <w:pPr>
-        <w:spacing w:after="120"/>
-      </w:pPr>
-      <w:r>
-        <w:rPr>
-          <w:rFonts w:ascii="Arial" w:hAnsi="Arial"/>
-          <w:sz w:val="20"/>
-        </w:rPr>
-        <w:t>---</w:t>
-      </w:r>
-    </w:p>
-    <w:p>
-      <w:pPr>
-        <w:spacing w:after="120"/>
-      </w:pPr>
-    </w:p>
-    <w:p>
-      <w:pPr>
-        <w:spacing w:before="280" w:after="120"/>
-      </w:pPr>
-      <w:r>
-        <w:rPr>
-          <w:rFonts w:ascii="Arial" w:hAnsi="Arial"/>
-          <w:b/>
-          <w:color w:val="2B6CB0"/>
-          <w:sz w:val="28"/>
-        </w:rPr>
-        <w:t>Part 3 – Pre-Submission Testing &amp; Environment Validation</w:t>
-      </w:r>
-    </w:p>
-    <w:p>
-      <w:pPr>
-        <w:spacing w:after="120"/>
-      </w:pPr>
-    </w:p>
-    <w:p>
-      <w:pPr>
-        <w:spacing w:before="240" w:after="80"/>
-      </w:pPr>
-      <w:r>
-        <w:rPr>
-          <w:rFonts w:ascii="Arial" w:hAnsi="Arial"/>
-          <w:b/>
-          <w:color w:val="2B6CB0"/>
-          <w:sz w:val="24"/>
-        </w:rPr>
-        <w:t>Task 1: Infrastructure and Deployment Readiness</w:t>
-      </w:r>
-    </w:p>
-    <w:p>
-      <w:pPr>
-        <w:spacing w:after="120"/>
-      </w:pPr>
-      <w:r>
-        <w:rPr>
-          <w:rFonts w:ascii="Arial" w:hAnsi="Arial"/>
-          <w:sz w:val="20"/>
-        </w:rPr>
-        <w:t>Before submission, conduct thorough testing of all deliverables to identify and resolve any bugs or issues. Prepare and validate the necessary infrastructure, environments, and configurations required to support deployment.</w:t>
-      </w:r>
-    </w:p>
-    <w:p>
-      <w:pPr>
-        <w:spacing w:after="120"/>
-      </w:pPr>
-    </w:p>
-    <w:p>
-      <w:pPr>
-        <w:spacing w:before="240" w:after="80"/>
-      </w:pPr>
-      <w:r>
-        <w:rPr>
-          <w:rFonts w:ascii="Arial" w:hAnsi="Arial"/>
-          <w:b/>
-          <w:color w:val="2B6CB0"/>
-          <w:sz w:val="24"/>
-        </w:rPr>
-        <w:t>Expected Deliverables:</w:t>
-      </w:r>
-    </w:p>
-    <w:p>
-      <w:pPr>
-        <w:pStyle w:val="ListBullet"/>
-        <w:spacing w:after="80"/>
-      </w:pPr>
-      <w:r>
-        <w:rPr>
-          <w:rFonts w:ascii="Arial" w:hAnsi="Arial"/>
-          <w:sz w:val="20"/>
-        </w:rPr>
-        <w:t>Verified host-level, container-level, and local Kubernetes deployment configurations.</w:t>
-      </w:r>
-    </w:p>
-    <w:p>
-      <w:pPr>
-        <w:pStyle w:val="ListBullet"/>
-        <w:spacing w:after="80"/>
-      </w:pPr>
-      <w:r>
-        <w:rPr>
-          <w:rFonts w:ascii="Arial" w:hAnsi="Arial"/>
-          <w:sz w:val="20"/>
-        </w:rPr>
-        <w:t>An exported and validated WSL distro backup (`.tar` file) ready for external execution.</w:t>
-      </w:r>
-    </w:p>
-    <w:p>
-      <w:pPr>
-        <w:spacing w:after="120"/>
-      </w:pPr>
-    </w:p>
-    <w:p>
-      <w:pPr>
-        <w:spacing w:after="120"/>
-      </w:pPr>
-      <w:r>
-        <w:rPr>
-          <w:rFonts w:ascii="Arial" w:hAnsi="Arial"/>
-          <w:sz w:val="20"/>
-        </w:rPr>
-        <w:t>---</w:t>
-      </w:r>
-    </w:p>
-    <w:p>
-      <w:pPr>
-        <w:spacing w:after="120"/>
-      </w:pPr>
-    </w:p>
-    <w:p>
-      <w:pPr>
-        <w:spacing w:before="280" w:after="120"/>
-      </w:pPr>
-      <w:r>
-        <w:rPr>
-          <w:rFonts w:ascii="Arial" w:hAnsi="Arial"/>
-          <w:b/>
-          <w:color w:val="2B6CB0"/>
-          <w:sz w:val="28"/>
-        </w:rPr>
-        <w:t>Part 4 – Final Submission Deadline</w:t>
-      </w:r>
-    </w:p>
-    <w:p>
-      <w:pPr>
-        <w:spacing w:after="120"/>
-      </w:pPr>
-    </w:p>
-    <w:p>
-      <w:pPr>
-        <w:spacing w:before="240" w:after="80"/>
-      </w:pPr>
-      <w:r>
-        <w:rPr>
-          <w:rFonts w:ascii="Arial" w:hAnsi="Arial"/>
-          <w:b/>
-          <w:color w:val="2B6CB0"/>
-          <w:sz w:val="24"/>
-        </w:rPr>
-        <w:t>Task 1: Repository Delivery</w:t>
-      </w:r>
-    </w:p>
-    <w:p>
-      <w:pPr>
-        <w:spacing w:after="120"/>
-      </w:pPr>
-      <w:r>
-        <w:rPr>
-          <w:rFonts w:ascii="Arial" w:hAnsi="Arial"/>
-          <w:sz w:val="20"/>
-        </w:rPr>
-        <w:t>You must submit a complete and accessible project repository—including the test environment, source code, configuration files, and documentation—no later than June 24, 2026, to allow the teacher to review and evaluate your work effectively.</w:t>
-      </w:r>
-    </w:p>
-    <w:p>
-      <w:pPr>
-        <w:spacing w:after="120"/>
-      </w:pPr>
-    </w:p>
-    <w:p>
-      <w:pPr>
-        <w:spacing w:before="240" w:after="80"/>
-      </w:pPr>
-      <w:r>
-        <w:rPr>
-          <w:rFonts w:ascii="Arial" w:hAnsi="Arial"/>
-          <w:b/>
-          <w:color w:val="2B6CB0"/>
-          <w:sz w:val="24"/>
-        </w:rPr>
-        <w:t>Expected Deliverables:</w:t>
-      </w:r>
-    </w:p>
-    <w:p>
-      <w:pPr>
-        <w:pStyle w:val="ListBullet"/>
-        <w:spacing w:after="80"/>
-      </w:pPr>
-      <w:r>
-        <w:rPr>
-          <w:rFonts w:ascii="Arial" w:hAnsi="Arial"/>
-          <w:sz w:val="20"/>
-        </w:rPr>
-        <w:t>Clean git repository containing code, `.env.sample` profiles, and kubernetes/docker-compose configurations.</w:t>
-      </w:r>
-    </w:p>
-    <w:p>
-      <w:pPr>
-        <w:pStyle w:val="ListBullet"/>
-        <w:spacing w:after="80"/>
-      </w:pPr>
-      <w:r>
-        <w:rPr>
-          <w:rFonts w:ascii="Arial" w:hAnsi="Arial"/>
-          <w:sz w:val="20"/>
-        </w:rPr>
-        <w:t>All compiled system documentation PDFs and Word documents.</w:t>
-      </w:r>
-    </w:p>
-    <w:p>
-      <w:pPr>
-        <w:spacing w:after="120"/>
-      </w:pPr>
-    </w:p>
-    <w:p>
-      <w:pPr>
-        <w:spacing w:after="120"/>
-      </w:pPr>
-      <w:r>
-        <w:rPr>
-          <w:rFonts w:ascii="Arial" w:hAnsi="Arial"/>
-          <w:sz w:val="20"/>
-        </w:rPr>
-        <w:t>---</w:t>
-      </w:r>
-    </w:p>
-    <w:p>
-      <w:pPr>
-        <w:spacing w:after="120"/>
-      </w:pPr>
-    </w:p>
-    <w:p>
-      <w:pPr>
-        <w:spacing w:before="280" w:after="120"/>
-      </w:pPr>
-      <w:r>
-        <w:rPr>
-          <w:rFonts w:ascii="Arial" w:hAnsi="Arial"/>
-          <w:b/>
-          <w:color w:val="2B6CB0"/>
-          <w:sz w:val="28"/>
-        </w:rPr>
-        <w:t>Part 5 – Evaluation Criteria</w:t>
-      </w:r>
-    </w:p>
-    <w:p>
-      <w:pPr>
-        <w:spacing w:after="120"/>
-      </w:pPr>
-    </w:p>
-    <w:p>
-      <w:pPr>
-        <w:spacing w:before="240" w:after="80"/>
-      </w:pPr>
-      <w:r>
-        <w:rPr>
-          <w:rFonts w:ascii="Arial" w:hAnsi="Arial"/>
-          <w:b/>
-          <w:color w:val="2B6CB0"/>
-          <w:sz w:val="24"/>
-        </w:rPr>
-        <w:t>Technical Implementation Rubric</w:t>
-      </w:r>
-    </w:p>
-    <w:tbl>
-      <w:tblPr>
-        <w:tblStyle w:val="LightShading-Accent1"/>
-        <w:tblW w:type="auto" w:w="0"/>
-        <w:tblLook w:firstColumn="1" w:firstRow="1" w:lastColumn="0" w:lastRow="0" w:noHBand="0" w:noVBand="1" w:val="04A0"/>
-      </w:tblPr>
-      <w:tblGrid>
-        <w:gridCol w:w="4680"/>
-        <w:gridCol w:w="4680"/>
-      </w:tblGrid>
-      <w:tr>
-        <w:tc>
-          <w:tcPr>
-            <w:tcW w:type="dxa" w:w="4680"/>
-          </w:tcPr>
-          <w:p>
-            <w:pPr>
-              <w:spacing w:after="40" w:before="40"/>
-            </w:pPr>
-            <w:r>
-              <w:rPr>
-                <w:rFonts w:ascii="Arial" w:hAnsi="Arial"/>
-                <w:sz w:val="19"/>
-              </w:rPr>
-              <w:t>Criteria</w:t>
-            </w:r>
-          </w:p>
-        </w:tc>
-        <w:tc>
-          <w:tcPr>
-            <w:tcW w:type="dxa" w:w="4680"/>
-          </w:tcPr>
-          <w:p>
-            <w:pPr>
-              <w:spacing w:after="40" w:before="40"/>
-            </w:pPr>
-            <w:r>
-              <w:rPr>
-                <w:rFonts w:ascii="Arial" w:hAnsi="Arial"/>
-                <w:sz w:val="19"/>
-              </w:rPr>
-              <w:t>Points</w:t>
-            </w:r>
-          </w:p>
-        </w:tc>
-      </w:tr>
-    </w:tbl>
-    <w:tbl>
-      <w:tblPr>
-        <w:tblStyle w:val="LightShading-Accent1"/>
-        <w:tblW w:type="auto" w:w="0"/>
-        <w:tblLook w:firstColumn="1" w:firstRow="1" w:lastColumn="0" w:lastRow="0" w:noHBand="0" w:noVBand="1" w:val="04A0"/>
-      </w:tblPr>
-      <w:tblGrid>
-        <w:gridCol w:w="4680"/>
-        <w:gridCol w:w="4680"/>
-      </w:tblGrid>
-      <w:tr>
-        <w:tc>
-          <w:tcPr>
-            <w:tcW w:type="dxa" w:w="4680"/>
-          </w:tcPr>
-          <w:p>
-            <w:pPr>
-              <w:spacing w:after="40" w:before="40"/>
-            </w:pPr>
-            <w:r>
-              <w:rPr>
-                <w:rFonts w:ascii="Arial" w:hAnsi="Arial"/>
-                <w:sz w:val="19"/>
-              </w:rPr>
-              <w:t>1. Agile Project Management Setup (Trello, Jira, etc.)</w:t>
-            </w:r>
-          </w:p>
-        </w:tc>
-        <w:tc>
-          <w:tcPr>
-            <w:tcW w:type="dxa" w:w="4680"/>
-          </w:tcPr>
-          <w:p>
-            <w:pPr>
-              <w:spacing w:after="40" w:before="40"/>
-            </w:pPr>
-            <w:r>
-              <w:rPr>
-                <w:rFonts w:ascii="Arial" w:hAnsi="Arial"/>
-                <w:sz w:val="19"/>
-              </w:rPr>
-              <w:t>4</w:t>
-            </w:r>
-          </w:p>
-        </w:tc>
-      </w:tr>
-    </w:tbl>
-    <w:tbl>
-      <w:tblPr>
-        <w:tblStyle w:val="LightShading-Accent1"/>
-        <w:tblW w:type="auto" w:w="0"/>
-        <w:tblLook w:firstColumn="1" w:firstRow="1" w:lastColumn="0" w:lastRow="0" w:noHBand="0" w:noVBand="1" w:val="04A0"/>
-      </w:tblPr>
-      <w:tblGrid>
-        <w:gridCol w:w="4680"/>
-        <w:gridCol w:w="4680"/>
-      </w:tblGrid>
-      <w:tr>
-        <w:tc>
-          <w:tcPr>
-            <w:tcW w:type="dxa" w:w="4680"/>
-          </w:tcPr>
-          <w:p>
-            <w:pPr>
-              <w:spacing w:after="40" w:before="40"/>
-            </w:pPr>
-            <w:r>
-              <w:rPr>
-                <w:rFonts w:ascii="Arial" w:hAnsi="Arial"/>
-                <w:sz w:val="19"/>
-              </w:rPr>
-              <w:t>2. Git Usage and Workflow (branches, commits, CI links)</w:t>
-            </w:r>
-          </w:p>
-        </w:tc>
-        <w:tc>
-          <w:tcPr>
-            <w:tcW w:type="dxa" w:w="4680"/>
-          </w:tcPr>
-          <w:p>
-            <w:pPr>
-              <w:spacing w:after="40" w:before="40"/>
-            </w:pPr>
-            <w:r>
-              <w:rPr>
-                <w:rFonts w:ascii="Arial" w:hAnsi="Arial"/>
-                <w:sz w:val="19"/>
-              </w:rPr>
-              <w:t>6</w:t>
-            </w:r>
-          </w:p>
-        </w:tc>
-      </w:tr>
-    </w:tbl>
-    <w:tbl>
-      <w:tblPr>
-        <w:tblStyle w:val="LightShading-Accent1"/>
-        <w:tblW w:type="auto" w:w="0"/>
-        <w:tblLook w:firstColumn="1" w:firstRow="1" w:lastColumn="0" w:lastRow="0" w:noHBand="0" w:noVBand="1" w:val="04A0"/>
-      </w:tblPr>
-      <w:tblGrid>
-        <w:gridCol w:w="4680"/>
-        <w:gridCol w:w="4680"/>
-      </w:tblGrid>
-      <w:tr>
-        <w:tc>
-          <w:tcPr>
-            <w:tcW w:type="dxa" w:w="4680"/>
-          </w:tcPr>
-          <w:p>
-            <w:pPr>
-              <w:spacing w:after="40" w:before="40"/>
-            </w:pPr>
-            <w:r>
-              <w:rPr>
-                <w:rFonts w:ascii="Arial" w:hAnsi="Arial"/>
-                <w:sz w:val="19"/>
-              </w:rPr>
-              <w:t>3. Dockerization of All Components (Dockerfiles, Compose)</w:t>
-            </w:r>
-          </w:p>
-        </w:tc>
-        <w:tc>
-          <w:tcPr>
-            <w:tcW w:type="dxa" w:w="4680"/>
-          </w:tcPr>
-          <w:p>
-            <w:pPr>
-              <w:spacing w:after="40" w:before="40"/>
-            </w:pPr>
-            <w:r>
-              <w:rPr>
-                <w:rFonts w:ascii="Arial" w:hAnsi="Arial"/>
-                <w:sz w:val="19"/>
-              </w:rPr>
-              <w:t>6</w:t>
-            </w:r>
-          </w:p>
-        </w:tc>
-      </w:tr>
-    </w:tbl>
-    <w:tbl>
-      <w:tblPr>
-        <w:tblStyle w:val="LightShading-Accent1"/>
-        <w:tblW w:type="auto" w:w="0"/>
-        <w:tblLook w:firstColumn="1" w:firstRow="1" w:lastColumn="0" w:lastRow="0" w:noHBand="0" w:noVBand="1" w:val="04A0"/>
-      </w:tblPr>
-      <w:tblGrid>
-        <w:gridCol w:w="4680"/>
-        <w:gridCol w:w="4680"/>
-      </w:tblGrid>
-      <w:tr>
-        <w:tc>
-          <w:tcPr>
-            <w:tcW w:type="dxa" w:w="4680"/>
-          </w:tcPr>
-          <w:p>
-            <w:pPr>
-              <w:spacing w:after="40" w:before="40"/>
-            </w:pPr>
-            <w:r>
-              <w:rPr>
-                <w:rFonts w:ascii="Arial" w:hAnsi="Arial"/>
-                <w:sz w:val="19"/>
-              </w:rPr>
-              <w:t>4. Jenkins CI/CD Pipelines (pull, test, build, deploy)</w:t>
-            </w:r>
-          </w:p>
-        </w:tc>
-        <w:tc>
-          <w:tcPr>
-            <w:tcW w:type="dxa" w:w="4680"/>
-          </w:tcPr>
-          <w:p>
-            <w:pPr>
-              <w:spacing w:after="40" w:before="40"/>
-            </w:pPr>
-            <w:r>
-              <w:rPr>
-                <w:rFonts w:ascii="Arial" w:hAnsi="Arial"/>
-                <w:sz w:val="19"/>
-              </w:rPr>
-              <w:t>2</w:t>
-            </w:r>
-          </w:p>
-        </w:tc>
-      </w:tr>
-    </w:tbl>
-    <w:tbl>
-      <w:tblPr>
-        <w:tblStyle w:val="LightShading-Accent1"/>
-        <w:tblW w:type="auto" w:w="0"/>
-        <w:tblLook w:firstColumn="1" w:firstRow="1" w:lastColumn="0" w:lastRow="0" w:noHBand="0" w:noVBand="1" w:val="04A0"/>
-      </w:tblPr>
-      <w:tblGrid>
-        <w:gridCol w:w="4680"/>
-        <w:gridCol w:w="4680"/>
-      </w:tblGrid>
-      <w:tr>
-        <w:tc>
-          <w:tcPr>
-            <w:tcW w:type="dxa" w:w="4680"/>
-          </w:tcPr>
-          <w:p>
-            <w:pPr>
-              <w:spacing w:after="40" w:before="40"/>
-            </w:pPr>
-            <w:r>
-              <w:rPr>
-                <w:rFonts w:ascii="Arial" w:hAnsi="Arial"/>
-                <w:sz w:val="19"/>
-              </w:rPr>
-              <w:t>5. Kubernetes Integration (pods, services, manifests)</w:t>
-            </w:r>
-          </w:p>
-        </w:tc>
-        <w:tc>
-          <w:tcPr>
-            <w:tcW w:type="dxa" w:w="4680"/>
-          </w:tcPr>
-          <w:p>
-            <w:pPr>
-              <w:spacing w:after="40" w:before="40"/>
-            </w:pPr>
-            <w:r>
-              <w:rPr>
-                <w:rFonts w:ascii="Arial" w:hAnsi="Arial"/>
-                <w:sz w:val="19"/>
-              </w:rPr>
-              <w:t>2</w:t>
-            </w:r>
-          </w:p>
-        </w:tc>
-      </w:tr>
-    </w:tbl>
-    <w:tbl>
-      <w:tblPr>
-        <w:tblStyle w:val="LightShading-Accent1"/>
-        <w:tblW w:type="auto" w:w="0"/>
-        <w:tblLook w:firstColumn="1" w:firstRow="1" w:lastColumn="0" w:lastRow="0" w:noHBand="0" w:noVBand="1" w:val="04A0"/>
-      </w:tblPr>
-      <w:tblGrid>
-        <w:gridCol w:w="4680"/>
-        <w:gridCol w:w="4680"/>
-      </w:tblGrid>
-      <w:tr>
-        <w:tc>
-          <w:tcPr>
-            <w:tcW w:type="dxa" w:w="4680"/>
-          </w:tcPr>
-          <w:p>
-            <w:pPr>
-              <w:spacing w:after="40" w:before="40"/>
-            </w:pPr>
-            <w:r>
-              <w:rPr>
-                <w:rFonts w:ascii="Arial" w:hAnsi="Arial"/>
-                <w:sz w:val="19"/>
-              </w:rPr>
-              <w:t>**Total**</w:t>
-            </w:r>
-          </w:p>
-        </w:tc>
-        <w:tc>
-          <w:tcPr>
-            <w:tcW w:type="dxa" w:w="4680"/>
-          </w:tcPr>
-          <w:p>
-            <w:pPr>
-              <w:spacing w:after="40" w:before="40"/>
-            </w:pPr>
-            <w:r>
-              <w:rPr>
-                <w:rFonts w:ascii="Arial" w:hAnsi="Arial"/>
-                <w:sz w:val="19"/>
-              </w:rPr>
-              <w:t>**20**</w:t>
-            </w:r>
-          </w:p>
-        </w:tc>
-      </w:tr>
-    </w:tbl>
-    <w:p>
-      <w:pPr>
-        <w:spacing w:after="120"/>
-      </w:pPr>
-    </w:p>
-    <w:p>
-      <w:pPr>
-        <w:spacing w:before="240" w:after="80"/>
-      </w:pPr>
-      <w:r>
-        <w:rPr>
-          <w:rFonts w:ascii="Arial" w:hAnsi="Arial"/>
-          <w:b/>
-          <w:color w:val="2B6CB0"/>
-          <w:sz w:val="24"/>
-        </w:rPr>
-        <w:t>Individual Workload Rubric</w:t>
-      </w:r>
-    </w:p>
-    <w:tbl>
-      <w:tblPr>
-        <w:tblStyle w:val="LightShading-Accent1"/>
-        <w:tblW w:type="auto" w:w="0"/>
-        <w:tblLook w:firstColumn="1" w:firstRow="1" w:lastColumn="0" w:lastRow="0" w:noHBand="0" w:noVBand="1" w:val="04A0"/>
-      </w:tblPr>
-      <w:tblGrid>
-        <w:gridCol w:w="4680"/>
-        <w:gridCol w:w="4680"/>
-      </w:tblGrid>
-      <w:tr>
-        <w:tc>
-          <w:tcPr>
-            <w:tcW w:type="dxa" w:w="4680"/>
-          </w:tcPr>
-          <w:p>
-            <w:pPr>
-              <w:spacing w:after="40" w:before="40"/>
-            </w:pPr>
-            <w:r>
-              <w:rPr>
-                <w:rFonts w:ascii="Arial" w:hAnsi="Arial"/>
-                <w:sz w:val="19"/>
-              </w:rPr>
-              <w:t>Criteria</w:t>
-            </w:r>
-          </w:p>
-        </w:tc>
-        <w:tc>
-          <w:tcPr>
-            <w:tcW w:type="dxa" w:w="4680"/>
-          </w:tcPr>
-          <w:p>
-            <w:pPr>
-              <w:spacing w:after="40" w:before="40"/>
-            </w:pPr>
-            <w:r>
-              <w:rPr>
-                <w:rFonts w:ascii="Arial" w:hAnsi="Arial"/>
-                <w:sz w:val="19"/>
-              </w:rPr>
-              <w:t>Points</w:t>
-            </w:r>
-          </w:p>
-        </w:tc>
-      </w:tr>
-    </w:tbl>
-    <w:tbl>
-      <w:tblPr>
-        <w:tblStyle w:val="LightShading-Accent1"/>
-        <w:tblW w:type="auto" w:w="0"/>
-        <w:tblLook w:firstColumn="1" w:firstRow="1" w:lastColumn="0" w:lastRow="0" w:noHBand="0" w:noVBand="1" w:val="04A0"/>
-      </w:tblPr>
-      <w:tblGrid>
-        <w:gridCol w:w="4680"/>
-        <w:gridCol w:w="4680"/>
-      </w:tblGrid>
-      <w:tr>
-        <w:tc>
-          <w:tcPr>
-            <w:tcW w:type="dxa" w:w="4680"/>
-          </w:tcPr>
-          <w:p>
-            <w:pPr>
-              <w:spacing w:after="40" w:before="40"/>
-            </w:pPr>
-            <w:r>
-              <w:rPr>
-                <w:rFonts w:ascii="Arial" w:hAnsi="Arial"/>
-                <w:sz w:val="19"/>
-              </w:rPr>
-              <w:t>1. Clear ownership of at least one project module</w:t>
-            </w:r>
-          </w:p>
-        </w:tc>
-        <w:tc>
-          <w:tcPr>
-            <w:tcW w:type="dxa" w:w="4680"/>
-          </w:tcPr>
-          <w:p>
-            <w:pPr>
-              <w:spacing w:after="40" w:before="40"/>
-            </w:pPr>
-            <w:r>
-              <w:rPr>
-                <w:rFonts w:ascii="Arial" w:hAnsi="Arial"/>
-                <w:sz w:val="19"/>
-              </w:rPr>
-              <w:t>5</w:t>
-            </w:r>
-          </w:p>
-        </w:tc>
-      </w:tr>
-    </w:tbl>
-    <w:tbl>
-      <w:tblPr>
-        <w:tblStyle w:val="LightShading-Accent1"/>
-        <w:tblW w:type="auto" w:w="0"/>
-        <w:tblLook w:firstColumn="1" w:firstRow="1" w:lastColumn="0" w:lastRow="0" w:noHBand="0" w:noVBand="1" w:val="04A0"/>
-      </w:tblPr>
-      <w:tblGrid>
-        <w:gridCol w:w="4680"/>
-        <w:gridCol w:w="4680"/>
-      </w:tblGrid>
-      <w:tr>
-        <w:tc>
-          <w:tcPr>
-            <w:tcW w:type="dxa" w:w="4680"/>
-          </w:tcPr>
-          <w:p>
-            <w:pPr>
-              <w:spacing w:after="40" w:before="40"/>
-            </w:pPr>
-            <w:r>
-              <w:rPr>
-                <w:rFonts w:ascii="Arial" w:hAnsi="Arial"/>
-                <w:sz w:val="19"/>
-              </w:rPr>
-              <w:t>2. Git contribution (commits, merges, documented code)</w:t>
-            </w:r>
-          </w:p>
-        </w:tc>
-        <w:tc>
-          <w:tcPr>
-            <w:tcW w:type="dxa" w:w="4680"/>
-          </w:tcPr>
-          <w:p>
-            <w:pPr>
-              <w:spacing w:after="40" w:before="40"/>
-            </w:pPr>
-            <w:r>
-              <w:rPr>
-                <w:rFonts w:ascii="Arial" w:hAnsi="Arial"/>
-                <w:sz w:val="19"/>
-              </w:rPr>
-              <w:t>5</w:t>
-            </w:r>
-          </w:p>
-        </w:tc>
-      </w:tr>
-    </w:tbl>
-    <w:tbl>
-      <w:tblPr>
-        <w:tblStyle w:val="LightShading-Accent1"/>
-        <w:tblW w:type="auto" w:w="0"/>
-        <w:tblLook w:firstColumn="1" w:firstRow="1" w:lastColumn="0" w:lastRow="0" w:noHBand="0" w:noVBand="1" w:val="04A0"/>
-      </w:tblPr>
-      <w:tblGrid>
-        <w:gridCol w:w="4680"/>
-        <w:gridCol w:w="4680"/>
-      </w:tblGrid>
-      <w:tr>
-        <w:tc>
-          <w:tcPr>
-            <w:tcW w:type="dxa" w:w="4680"/>
-          </w:tcPr>
-          <w:p>
-            <w:pPr>
-              <w:spacing w:after="40" w:before="40"/>
-            </w:pPr>
-            <w:r>
-              <w:rPr>
-                <w:rFonts w:ascii="Arial" w:hAnsi="Arial"/>
-                <w:sz w:val="19"/>
-              </w:rPr>
-              <w:t>3. Quality and completeness of the assigned task</w:t>
-            </w:r>
-          </w:p>
-        </w:tc>
-        <w:tc>
-          <w:tcPr>
-            <w:tcW w:type="dxa" w:w="4680"/>
-          </w:tcPr>
-          <w:p>
-            <w:pPr>
-              <w:spacing w:after="40" w:before="40"/>
-            </w:pPr>
-            <w:r>
-              <w:rPr>
-                <w:rFonts w:ascii="Arial" w:hAnsi="Arial"/>
-                <w:sz w:val="19"/>
-              </w:rPr>
-              <w:t>5</w:t>
-            </w:r>
-          </w:p>
-        </w:tc>
-      </w:tr>
-    </w:tbl>
-    <w:tbl>
-      <w:tblPr>
-        <w:tblStyle w:val="LightShading-Accent1"/>
-        <w:tblW w:type="auto" w:w="0"/>
-        <w:tblLook w:firstColumn="1" w:firstRow="1" w:lastColumn="0" w:lastRow="0" w:noHBand="0" w:noVBand="1" w:val="04A0"/>
-      </w:tblPr>
-      <w:tblGrid>
-        <w:gridCol w:w="4680"/>
-        <w:gridCol w:w="4680"/>
-      </w:tblGrid>
-      <w:tr>
-        <w:tc>
-          <w:tcPr>
-            <w:tcW w:type="dxa" w:w="4680"/>
-          </w:tcPr>
-          <w:p>
-            <w:pPr>
-              <w:spacing w:after="40" w:before="40"/>
-            </w:pPr>
-            <w:r>
-              <w:rPr>
-                <w:rFonts w:ascii="Arial" w:hAnsi="Arial"/>
-                <w:sz w:val="19"/>
-              </w:rPr>
-              <w:t>4. Teamwork and collaboration (responsiveness, support)</w:t>
-            </w:r>
-          </w:p>
-        </w:tc>
-        <w:tc>
-          <w:tcPr>
-            <w:tcW w:type="dxa" w:w="4680"/>
-          </w:tcPr>
-          <w:p>
-            <w:pPr>
-              <w:spacing w:after="40" w:before="40"/>
-            </w:pPr>
-            <w:r>
-              <w:rPr>
-                <w:rFonts w:ascii="Arial" w:hAnsi="Arial"/>
-                <w:sz w:val="19"/>
-              </w:rPr>
-              <w:t>5</w:t>
-            </w:r>
-          </w:p>
-        </w:tc>
-      </w:tr>
-    </w:tbl>
-    <w:tbl>
-      <w:tblPr>
-        <w:tblStyle w:val="LightShading-Accent1"/>
-        <w:tblW w:type="auto" w:w="0"/>
-        <w:tblLook w:firstColumn="1" w:firstRow="1" w:lastColumn="0" w:lastRow="0" w:noHBand="0" w:noVBand="1" w:val="04A0"/>
-      </w:tblPr>
-      <w:tblGrid>
-        <w:gridCol w:w="4680"/>
-        <w:gridCol w:w="4680"/>
-      </w:tblGrid>
-      <w:tr>
-        <w:tc>
-          <w:tcPr>
-            <w:tcW w:type="dxa" w:w="4680"/>
-          </w:tcPr>
-          <w:p>
-            <w:pPr>
-              <w:spacing w:after="40" w:before="40"/>
-            </w:pPr>
-            <w:r>
-              <w:rPr>
-                <w:rFonts w:ascii="Arial" w:hAnsi="Arial"/>
-                <w:sz w:val="19"/>
-              </w:rPr>
-              <w:t>**Total**</w:t>
-            </w:r>
-          </w:p>
-        </w:tc>
-        <w:tc>
-          <w:tcPr>
-            <w:tcW w:type="dxa" w:w="4680"/>
-          </w:tcPr>
-          <w:p>
-            <w:pPr>
-              <w:spacing w:after="40" w:before="40"/>
-            </w:pPr>
-            <w:r>
-              <w:rPr>
-                <w:rFonts w:ascii="Arial" w:hAnsi="Arial"/>
-                <w:sz w:val="19"/>
-              </w:rPr>
-              <w:t>**20**</w:t>
-            </w:r>
-          </w:p>
-        </w:tc>
-      </w:tr>
-    </w:tbl>
-    <w:p>
-      <w:pPr>
-        <w:spacing w:after="120"/>
-      </w:pPr>
-    </w:p>
-    <w:p>
-      <w:pPr>
-        <w:spacing w:before="240" w:after="80"/>
-      </w:pPr>
-      <w:r>
-        <w:rPr>
-          <w:rFonts w:ascii="Arial" w:hAnsi="Arial"/>
-          <w:b/>
-          <w:color w:val="2B6CB0"/>
-          <w:sz w:val="24"/>
-        </w:rPr>
-        <w:t>Presentation &amp; Documentation Rubric</w:t>
-      </w:r>
-    </w:p>
-    <w:tbl>
-      <w:tblPr>
-        <w:tblStyle w:val="LightShading-Accent1"/>
-        <w:tblW w:type="auto" w:w="0"/>
-        <w:tblLook w:firstColumn="1" w:firstRow="1" w:lastColumn="0" w:lastRow="0" w:noHBand="0" w:noVBand="1" w:val="04A0"/>
-      </w:tblPr>
-      <w:tblGrid>
-        <w:gridCol w:w="4680"/>
-        <w:gridCol w:w="4680"/>
-      </w:tblGrid>
-      <w:tr>
-        <w:tc>
-          <w:tcPr>
-            <w:tcW w:type="dxa" w:w="4680"/>
-          </w:tcPr>
-          <w:p>
-            <w:pPr>
-              <w:spacing w:after="40" w:before="40"/>
-            </w:pPr>
-            <w:r>
-              <w:rPr>
-                <w:rFonts w:ascii="Arial" w:hAnsi="Arial"/>
-                <w:sz w:val="19"/>
-              </w:rPr>
-              <w:t>Criteria</w:t>
-            </w:r>
-          </w:p>
-        </w:tc>
-        <w:tc>
-          <w:tcPr>
-            <w:tcW w:type="dxa" w:w="4680"/>
-          </w:tcPr>
-          <w:p>
-            <w:pPr>
-              <w:spacing w:after="40" w:before="40"/>
-            </w:pPr>
-            <w:r>
-              <w:rPr>
-                <w:rFonts w:ascii="Arial" w:hAnsi="Arial"/>
-                <w:sz w:val="19"/>
-              </w:rPr>
-              <w:t>Points</w:t>
-            </w:r>
-          </w:p>
-        </w:tc>
-      </w:tr>
-    </w:tbl>
-    <w:tbl>
-      <w:tblPr>
-        <w:tblStyle w:val="LightShading-Accent1"/>
-        <w:tblW w:type="auto" w:w="0"/>
-        <w:tblLook w:firstColumn="1" w:firstRow="1" w:lastColumn="0" w:lastRow="0" w:noHBand="0" w:noVBand="1" w:val="04A0"/>
-      </w:tblPr>
-      <w:tblGrid>
-        <w:gridCol w:w="4680"/>
-        <w:gridCol w:w="4680"/>
-      </w:tblGrid>
-      <w:tr>
-        <w:tc>
-          <w:tcPr>
-            <w:tcW w:type="dxa" w:w="4680"/>
-          </w:tcPr>
-          <w:p>
-            <w:pPr>
-              <w:spacing w:after="40" w:before="40"/>
-            </w:pPr>
-            <w:r>
-              <w:rPr>
-                <w:rFonts w:ascii="Arial" w:hAnsi="Arial"/>
-                <w:sz w:val="19"/>
-              </w:rPr>
-              <w:t>1. Presentation of project flow, architecture, and outcomes</w:t>
-            </w:r>
-          </w:p>
-        </w:tc>
-        <w:tc>
-          <w:tcPr>
-            <w:tcW w:type="dxa" w:w="4680"/>
-          </w:tcPr>
-          <w:p>
-            <w:pPr>
-              <w:spacing w:after="40" w:before="40"/>
-            </w:pPr>
-            <w:r>
-              <w:rPr>
-                <w:rFonts w:ascii="Arial" w:hAnsi="Arial"/>
-                <w:sz w:val="19"/>
-              </w:rPr>
-              <w:t>5</w:t>
-            </w:r>
-          </w:p>
-        </w:tc>
-      </w:tr>
-    </w:tbl>
-    <w:tbl>
-      <w:tblPr>
-        <w:tblStyle w:val="LightShading-Accent1"/>
-        <w:tblW w:type="auto" w:w="0"/>
-        <w:tblLook w:firstColumn="1" w:firstRow="1" w:lastColumn="0" w:lastRow="0" w:noHBand="0" w:noVBand="1" w:val="04A0"/>
-      </w:tblPr>
-      <w:tblGrid>
-        <w:gridCol w:w="4680"/>
-        <w:gridCol w:w="4680"/>
-      </w:tblGrid>
-      <w:tr>
-        <w:tc>
-          <w:tcPr>
-            <w:tcW w:type="dxa" w:w="4680"/>
-          </w:tcPr>
-          <w:p>
-            <w:pPr>
-              <w:spacing w:after="40" w:before="40"/>
-            </w:pPr>
-            <w:r>
-              <w:rPr>
-                <w:rFonts w:ascii="Arial" w:hAnsi="Arial"/>
-                <w:sz w:val="19"/>
-              </w:rPr>
-              <w:t>2. Live demo or screenshots of working services (Zabbix, app, DB, etc.)</w:t>
-            </w:r>
-          </w:p>
-        </w:tc>
-        <w:tc>
-          <w:tcPr>
-            <w:tcW w:type="dxa" w:w="4680"/>
-          </w:tcPr>
-          <w:p>
-            <w:pPr>
-              <w:spacing w:after="40" w:before="40"/>
-            </w:pPr>
-            <w:r>
-              <w:rPr>
-                <w:rFonts w:ascii="Arial" w:hAnsi="Arial"/>
-                <w:sz w:val="19"/>
-              </w:rPr>
-              <w:t>5</w:t>
-            </w:r>
-          </w:p>
-        </w:tc>
-      </w:tr>
-    </w:tbl>
-    <w:tbl>
-      <w:tblPr>
-        <w:tblStyle w:val="LightShading-Accent1"/>
-        <w:tblW w:type="auto" w:w="0"/>
-        <w:tblLook w:firstColumn="1" w:firstRow="1" w:lastColumn="0" w:lastRow="0" w:noHBand="0" w:noVBand="1" w:val="04A0"/>
-      </w:tblPr>
-      <w:tblGrid>
-        <w:gridCol w:w="4680"/>
-        <w:gridCol w:w="4680"/>
-      </w:tblGrid>
-      <w:tr>
-        <w:tc>
-          <w:tcPr>
-            <w:tcW w:type="dxa" w:w="4680"/>
-          </w:tcPr>
-          <w:p>
-            <w:pPr>
-              <w:spacing w:after="40" w:before="40"/>
-            </w:pPr>
-            <w:r>
-              <w:rPr>
-                <w:rFonts w:ascii="Arial" w:hAnsi="Arial"/>
-                <w:sz w:val="19"/>
-              </w:rPr>
-              <w:t>3. Technical documentation (README, config files, usage guide)</w:t>
-            </w:r>
-          </w:p>
-        </w:tc>
-        <w:tc>
-          <w:tcPr>
-            <w:tcW w:type="dxa" w:w="4680"/>
-          </w:tcPr>
-          <w:p>
-            <w:pPr>
-              <w:spacing w:after="40" w:before="40"/>
-            </w:pPr>
-            <w:r>
-              <w:rPr>
-                <w:rFonts w:ascii="Arial" w:hAnsi="Arial"/>
-                <w:sz w:val="19"/>
-              </w:rPr>
-              <w:t>5</w:t>
-            </w:r>
-          </w:p>
-        </w:tc>
-      </w:tr>
-    </w:tbl>
-    <w:tbl>
-      <w:tblPr>
-        <w:tblStyle w:val="LightShading-Accent1"/>
-        <w:tblW w:type="auto" w:w="0"/>
-        <w:tblLook w:firstColumn="1" w:firstRow="1" w:lastColumn="0" w:lastRow="0" w:noHBand="0" w:noVBand="1" w:val="04A0"/>
-      </w:tblPr>
-      <w:tblGrid>
-        <w:gridCol w:w="4680"/>
-        <w:gridCol w:w="4680"/>
-      </w:tblGrid>
-      <w:tr>
-        <w:tc>
-          <w:tcPr>
-            <w:tcW w:type="dxa" w:w="4680"/>
-          </w:tcPr>
-          <w:p>
-            <w:pPr>
-              <w:spacing w:after="40" w:before="40"/>
-            </w:pPr>
-            <w:r>
-              <w:rPr>
-                <w:rFonts w:ascii="Arial" w:hAnsi="Arial"/>
-                <w:sz w:val="19"/>
-              </w:rPr>
-              <w:t>4. Clarity, structure, and engagement during oral presentation</w:t>
-            </w:r>
-          </w:p>
-        </w:tc>
-        <w:tc>
-          <w:tcPr>
-            <w:tcW w:type="dxa" w:w="4680"/>
-          </w:tcPr>
-          <w:p>
-            <w:pPr>
-              <w:spacing w:after="40" w:before="40"/>
-            </w:pPr>
-            <w:r>
-              <w:rPr>
-                <w:rFonts w:ascii="Arial" w:hAnsi="Arial"/>
-                <w:sz w:val="19"/>
-              </w:rPr>
-              <w:t>5</w:t>
-            </w:r>
-          </w:p>
-        </w:tc>
-      </w:tr>
-    </w:tbl>
-    <w:tbl>
-      <w:tblPr>
-        <w:tblStyle w:val="LightShading-Accent1"/>
-        <w:tblW w:type="auto" w:w="0"/>
-        <w:tblLook w:firstColumn="1" w:firstRow="1" w:lastColumn="0" w:lastRow="0" w:noHBand="0" w:noVBand="1" w:val="04A0"/>
-      </w:tblPr>
-      <w:tblGrid>
-        <w:gridCol w:w="4680"/>
-        <w:gridCol w:w="4680"/>
-      </w:tblGrid>
-      <w:tr>
-        <w:tc>
-          <w:tcPr>
-            <w:tcW w:type="dxa" w:w="4680"/>
-          </w:tcPr>
-          <w:p>
-            <w:pPr>
-              <w:spacing w:after="40" w:before="40"/>
-            </w:pPr>
-            <w:r>
-              <w:rPr>
-                <w:rFonts w:ascii="Arial" w:hAnsi="Arial"/>
-                <w:sz w:val="19"/>
-              </w:rPr>
-              <w:t>**Total**</w:t>
-            </w:r>
-          </w:p>
-        </w:tc>
-        <w:tc>
-          <w:tcPr>
-            <w:tcW w:type="dxa" w:w="4680"/>
-          </w:tcPr>
-          <w:p>
-            <w:pPr>
-              <w:spacing w:after="40" w:before="40"/>
-            </w:pPr>
-            <w:r>
-              <w:rPr>
-                <w:rFonts w:ascii="Arial" w:hAnsi="Arial"/>
-                <w:sz w:val="19"/>
-              </w:rPr>
-              <w:t>**20**</w:t>
-            </w:r>
-          </w:p>
-        </w:tc>
-      </w:tr>
-    </w:tbl>
-    <w:p>
-      <w:pPr>
-        <w:spacing w:after="120"/>
-      </w:pPr>
-    </w:p>
-    <w:sectPr>
-      <w:pgSz w:w="12240" w:h="15840"/>
-      <w:pgMar w:top="1440" w:right="1440" w:bottom="1440" w:left="1440" w:header="720" w:footer="720" w:gutter="0"/>
-      <w:cols w:space="720"/>
-      <w:docGrid w:linePitch="360"/>
-    </w:sectPr>
-  </w:body>
-</w:document>
-</file>
 
 <file path=word/numbering.xml><?xml version="1.0" encoding="utf-8"?>
 <w:numbering xmlns:wpc="http://schemas.microsoft.com/office/word/2010/wordprocessingCanvas" xmlns:mo="http://schemas.microsoft.com/office/mac/office/2008/main" xmlns:mc="http://schemas.openxmlformats.org/markup-compatibility/2006" xmlns:mv="urn:schemas-microsoft-com:mac:vml" xmlns:o="urn:schemas-microsoft-com:office:office" xmlns:r="http://schemas.openxmlformats.org/officeDocument/2006/relationships" xmlns:m="http://schemas.openxmlformats.org/officeDocument/2006/math" xmlns:v="urn:schemas-microsoft-com:vml" xmlns:wp14="http://schemas.microsoft.com/office/word/2010/wordprocessingDrawing" xmlns:wp="http://schemas.openxmlformats.org/drawingml/2006/wordprocessingDrawing" xmlns:w10="urn:schemas-microsoft-com:office:word" xmlns:w="http://schemas.openxmlformats.org/wordprocessingml/2006/main" xmlns:w14="http://schemas.microsoft.com/office/word/2010/wordml" xmlns:wpg="http://schemas.microsoft.com/office/word/2010/wordprocessingGroup" xmlns:wpi="http://schemas.microsoft.com/office/word/2010/wordprocessingInk" xmlns:wne="http://schemas.microsoft.com/office/word/2006/wordml" xmlns:wps="http://schemas.microsoft.com/office/word/2010/wordprocessingShape" mc:Ignorable="w14 wp14">

</xml_diff>